<commit_message>
Survey 2: reviewer-style fixes - title, scope framing, E5 rule, evidence-scale justification, sensitivity check, section roles; summaries checked against full texts
</commit_message>
<xml_diff>
--- a/github/m/Survey2_AIR_Manuscript.docx
+++ b/github/m/Survey2_AIR_Manuscript.docx
@@ -7,7 +7,7 @@
         <w:pStyle w:val="Title"/>
       </w:pPr>
       <w:r>
-        <w:t xml:space="preserve">Quantum-Inspired</w:t>
+        <w:t xml:space="preserve">Quantum-Like</w:t>
       </w:r>
       <w:r>
         <w:t xml:space="preserve"> </w:t>
@@ -2127,7 +2127,33 @@
         <w:t xml:space="preserve"> </w:t>
       </w:r>
       <w:r>
-        <w:t xml:space="preserve">and is not repeated here (Section 2.5.4). Quantum-inspired optimisation heuristics for robots, such as quantum-behaved particle swarm and quantum-inspired evolutionary algorithms for path planning, scheduling and SLAM, are classical optimisers rather than models of cognition, decision or learning; they are outside this review and are summarised among the emerging directions of the companion survey. Claims that the brain is a quantum computer are treated only in Section 21.</w:t>
+        <w:t xml:space="preserve">and is not repeated here (Section 2.5.4). Quantum-inspired optimisation heuristics for robots, such as quantum-behaved particle swarm and quantum-inspired evolutionary algorithms for path planning, scheduling and SLAM, are classical optimisers rather than models of cognition, decision or learning; they are outside this review and are summarised among the emerging directions of the companion survey. Claims that the brain is a quantum computer are treated only in Section 21. The title says</w:t>
+      </w:r>
+      <w:r>
+        <w:t xml:space="preserve"> </w:t>
+      </w:r>
+      <w:r>
+        <w:t xml:space="preserve">“</w:t>
+      </w:r>
+      <w:r>
+        <w:t xml:space="preserve">quantum-like</w:t>
+      </w:r>
+      <w:r>
+        <w:t xml:space="preserve">”</w:t>
+      </w:r>
+      <w:r>
+        <w:t xml:space="preserve"> </w:t>
+      </w:r>
+      <w:r>
+        <w:t xml:space="preserve">because quantum-like models, which use QP to represent beliefs and judgements, are the core of the review and of its psychological evidence; quantum-inspired and quantum-circuit models are reviewed alongside them as related classes and are labelled as such throughout.</w:t>
+      </w:r>
+    </w:p>
+    <w:p>
+      <w:pPr>
+        <w:pStyle w:val="BodyText"/>
+      </w:pPr>
+      <w:r>
+        <w:t xml:space="preserve">Robots are the motivating case, but they are not where most of the evidence lies. Of the 67 application studies, 17 concern robots and embodied agents, and none of these tests a QP decision module on a robot; the stronger evidence comes from human–AI trust, decision support and AI systems. The review therefore moves from robotics outwards to AI and ML systems, and it reports explicitly, function by function, where robot evidence is missing (Sections 6 and 11).</w:t>
       </w:r>
     </w:p>
     <w:p>
@@ -2473,6 +2499,40 @@
       </w:r>
       <w:r>
         <w:t xml:space="preserve">. They are listed with the reason for exclusion in Online Resource 1 (Table S7).</w:t>
+      </w:r>
+    </w:p>
+    <w:p>
+      <w:pPr>
+        <w:pStyle w:val="BodyText"/>
+      </w:pPr>
+      <w:r>
+        <w:t xml:space="preserve">The boundary between I1 and E5 follows one rule: what the quantum states and measurements stand for. If they represent cognitive content, such as beliefs, preferences, percepts, emotions or decisions, the study is in scope even when it runs on a QPU; this is why circuit implementations of cognitive models on quantum hardware are included </w:t>
+      </w:r>
+      <w:r>
+        <w:t xml:space="preserve">(Widdows, Rani, and Pothos 2023)</w:t>
+      </w:r>
+      <w:r>
+        <w:t xml:space="preserve">. If they encode a classical problem to be solved faster, such as a QUBO, a search or a policy approximator, the study falls under E5 even when it is described as cognitive. One included study is borderline: it embeds Grover search and other textbook circuits in a cognitive agent architecture, and it was kept because the circuits are part of the agent’s decision process rather than an external solver </w:t>
+      </w:r>
+      <w:r>
+        <w:t xml:space="preserve">(Daglarli 2025)</w:t>
+      </w:r>
+      <w:r>
+        <w:t xml:space="preserve">; it is flagged as borderline in Online Resource 3.</w:t>
+      </w:r>
+    </w:p>
+    <w:p>
+      <w:pPr>
+        <w:pStyle w:val="BodyText"/>
+      </w:pPr>
+      <w:r>
+        <w:t xml:space="preserve">Eleven application studies are quantum-inspired or quantum-circuit models of representation in ML and language processing (complex-valued embeddings, density-matrix and tensor-network models, a quantum natural-language classifier) that use QP structure without modelling human judgement </w:t>
+      </w:r>
+      <w:r>
+        <w:t xml:space="preserve">(Widdows and Peters 2003; Sordoni, Nie, and Bengio 2013; Stoudenmire and Schwab 2016; P. Zhang et al. 2018; Li, Wang, and Melucci 2019; Li, Gkoumas, Lioma, et al. 2021; Li, Gkoumas, Sordoni, et al. 2021; Svozil 2025; C. Zhang et al. 2025; Nebli, Saadatdoorabi, and Yam 2026; Lorenz et al. 2023)</w:t>
+      </w:r>
+      <w:r>
+        <w:t xml:space="preserve">. They meet I1 because they apply QP models to AI systems, but they are the furthest from cognition. As a sensitivity check, removing them leaves 56 application studies (E1 6, E2 16, E3 9, E4 21, E5 4), of which 18 of the 50 appraised compare fully against a classical model (36%, against 39% with them); none of the conclusions of Section 13.3 changes.</w:t>
       </w:r>
     </w:p>
     <w:bookmarkEnd w:id="27"/>
@@ -2599,7 +2659,7 @@
         <w:t xml:space="preserve">(Guru and Chauhan 2026)</w:t>
       </w:r>
       <w:r>
-        <w:t xml:space="preserve">. That scale has no rung for human data, which is the first test of a cognitive model, so it is not used here.</w:t>
+        <w:t xml:space="preserve">. That scale has no rung for human data, which is the first test of a cognitive model, so it is not used here. The six levels follow the steps a cognitive model must pass before it can be trusted in an autonomous system: it is stated (E1), formalised (E2), tested on the human behaviour it claims to describe (E3), shown to work in an artificial agent or benchmark (E4), run on a physical system (E5) and used in the field (E6). The scale is ordinal and was designed for this review, in the spirit of technology-readiness and evidence hierarchies, so it has not been validated independently; a study is placed at the highest level its own evidence reaches, and ambiguous cases received the lower level. To estimate its reliability, a second rater independently re-graded a random sample of the graded studies [FILL: second rater; sample size (20% = 28 studies); Cohen’s kappa for evidence levels and for criteria Q1–Q7].</w:t>
       </w:r>
     </w:p>
     <w:bookmarkEnd w:id="30"/>
@@ -3350,7 +3410,7 @@
         <w:t xml:space="preserve">Selection and grading</w:t>
       </w:r>
       <w:r>
-        <w:t xml:space="preserve">: a single author screened the records and extracted the data, and the second author reviewed rather than independently repeated the grading, so grading reliability cannot be measured; every judgement is published so that readers can check it.</w:t>
+        <w:t xml:space="preserve">: a single author screened the records and extracted the data, and the second author reviewed rather than independently repeated the grading, so grading reliability rests on the second-rater sample described under Evidence levels; every judgement is published so that readers can check it.</w:t>
       </w:r>
       <w:r>
         <w:t xml:space="preserve"> </w:t>
@@ -11031,6 +11091,30 @@
         <w:t xml:space="preserve">Prior Work and Positioning</w:t>
       </w:r>
     </w:p>
+    <w:p>
+      <w:pPr>
+        <w:pStyle w:val="FirstParagraph"/>
+      </w:pPr>
+      <w:r>
+        <w:t xml:space="preserve">This section positions the primary literature and synthesises the evidence of Sections 5–12; earlier</w:t>
+      </w:r>
+      <w:r>
+        <w:t xml:space="preserve"> </w:t>
+      </w:r>
+      <w:r>
+        <w:rPr>
+          <w:iCs/>
+          <w:i/>
+        </w:rPr>
+        <w:t xml:space="preserve">reviews</w:t>
+      </w:r>
+      <w:r>
+        <w:t xml:space="preserve"> </w:t>
+      </w:r>
+      <w:r>
+        <w:t xml:space="preserve">are compared in Section 23.</w:t>
+      </w:r>
+    </w:p>
     <w:bookmarkStart w:id="163" w:name="quantum-cognition-in-psychology"/>
     <w:p>
       <w:pPr>
@@ -12367,7 +12451,13 @@
         <w:t xml:space="preserve">(Dong et al. 2012)</w:t>
       </w:r>
       <w:r>
-        <w:t xml:space="preserve">, but our illustrative experiment shows instability under reward noise (Section 16.3). Circuit-based RL, reviewed in the companion survey, is parameter-efficient but not yet better or faster in wall-clock terms </w:t>
+        <w:t xml:space="preserve">, but our illustrative experiment shows instability under reward noise (Section 16.3). Circuit-based RL is parameter-efficient on benchmark tasks but not yet better or faster in wall-clock terms </w:t>
+      </w:r>
+      <w:r>
+        <w:t xml:space="preserve">(Skolik, Jerbi, and Dunjko 2022; Jerbi et al. 2021; Meyer et al. 2022)</w:t>
+      </w:r>
+      <w:r>
+        <w:t xml:space="preserve">, as the companion survey also concludes for robots </w:t>
       </w:r>
       <w:r>
         <w:t xml:space="preserve">(Guru and Chauhan 2026)</w:t>
@@ -12569,7 +12659,7 @@
         <w:pStyle w:val="FirstParagraph"/>
       </w:pPr>
       <w:r>
-        <w:t xml:space="preserve">Because the literature contains almost no controlled comparisons on autonomous systems, we propose a two-phase validation programme. Each task has a classical baseline, a quantum-like model and an a priori QP prediction that can fail.</w:t>
+        <w:t xml:space="preserve">Sections 15, 22 and 24 have distinct roles: this section states which experiments are needed, Section 22 specifies the benchmarks and reporting standard for running them, and Section 24 lists the open research problems that remain beyond them. Because the literature contains almost no controlled comparisons on autonomous systems, we propose a two-phase validation programme. Each task has a classical baseline, a quantum-like model and an a priori QP prediction that can fail.</w:t>
       </w:r>
     </w:p>
     <w:bookmarkStart w:id="191" w:name="phase-1-simulation-benchmark-tasks"/>
@@ -13288,7 +13378,7 @@
         <w:pStyle w:val="FirstParagraph"/>
       </w:pPr>
       <w:r>
-        <w:t xml:space="preserve">The three case studies use the code in Appendix B (Online Resource 2); their numerical values are collected in Appendix C.</w:t>
+        <w:t xml:space="preserve">Case Studies 1 and 2 are worked numerical examples that show what a QP model computes and predicts; they are not experiments and report no performance results. Case Study 3 is a small illustrative experiment. All three use the code in Appendix B (Online Resource 2); their numerical values are collected in Appendix C.</w:t>
       </w:r>
     </w:p>
     <w:bookmarkStart w:id="202" w:name="sec:case-fusion"/>
@@ -13450,7 +13540,7 @@
       </w:r>
     </w:p>
     <w:bookmarkEnd w:id="200"/>
-    <w:bookmarkStart w:id="201" w:name="results-and-comparison"/>
+    <w:bookmarkStart w:id="201" w:name="X833248bf7b2a2f04fcfd6c65f643b190900748b"/>
     <w:p>
       <w:pPr>
         <w:pStyle w:val="Heading3"/>
@@ -13465,7 +13555,7 @@
         <w:tab/>
       </w:r>
       <w:r>
-        <w:t xml:space="preserve">Results and Comparison</w:t>
+        <w:t xml:space="preserve">Results and Comparison: What the Worked Example Shows</w:t>
       </w:r>
     </w:p>
     <w:p>
@@ -13858,7 +13948,7 @@
         </w:r>
       </w:hyperlink>
       <w:r>
-        <w:t xml:space="preserve">). The ε-greedy agent converged fastest (first episode at which the 10-episode moving average fell to 15 steps or fewer: 60 ± 6), while QRL (134 ± 20) and softmax (128 ± 10) were similar. With noisy rewards, QRL learned fastest at first: its median path length was 70 steps at episode 100, against 153 for ε-greedy and 200 (no progress) for softmax. However, it did not stabilise. Over the last 50 episodes its mean path length was 67 ± 40 steps, against 14 ± 13 for ε-greedy and 16 ± 17 for softmax, and 5 of 30 seeds never met the convergence criterion. Varying k did not remove the instability (final means of 78, 67 and 74 steps for k = 10, 30 and 100). The reason is structural: amplitude amplification only increases the probability of rewarded actions, so an action amplified by a noisy positive reward is never de-amplified. The experiment is small and illustrative, but it shows why quantum-inspired RL must be compared with tuned classical baselines under realistic noise, and it points to a concrete design fix: amplitude updates that can also decrease (Appendix E). Full results are in Appendix C.</w:t>
+        <w:t xml:space="preserve">). The ε-greedy agent converged fastest (first episode at which the 10-episode moving average fell to 15 steps or fewer: 60 ± 6), while QRL (134 ± 20) and softmax (128 ± 10) were similar. With noisy rewards, QRL learned fastest at first: its median path length was 70 steps at episode 100, against 153 for ε-greedy and 200 (no progress) for softmax. However, it did not stabilise. Over the last 50 episodes its mean path length was 67 ± 40 steps, against 14 ± 13 for ε-greedy and 16 ± 17 for softmax, and 5 of 30 seeds never met the convergence criterion. Varying k did not remove the instability (final means of 78, 67 and 74 steps for k = 10, 30 and 100). The reason is structural: amplitude amplification only increases the probability of rewarded actions, so an action amplified by a noisy positive reward is never de-amplified. The experiment is small and illustrative: one tabular task, one quantum-inspired variant and two simple classical baselines, so it is not a benchmark and does not show that quantum-inspired RL is generally worse; a fair evaluation would use the protocol of Benchmark 4. It does show why quantum-inspired RL must be compared with tuned classical baselines under realistic noise, and it points to a concrete design fix: amplitude updates that can also decrease (Appendix E). Full results are in Appendix C.</w:t>
       </w:r>
     </w:p>
     <w:p>
@@ -15829,7 +15919,7 @@
         <w:pStyle w:val="FirstParagraph"/>
       </w:pPr>
       <w:r>
-        <w:t xml:space="preserve">Existing reviews cover neighbouring areas but not their intersection (Table</w:t>
+        <w:t xml:space="preserve">Section 13 positioned the primary studies; this section compares the review with earlier reviews. Existing reviews cover neighbouring areas but not their intersection (Table</w:t>
       </w:r>
       <w:r>
         <w:t xml:space="preserve"> </w:t>
@@ -17094,6 +17184,104 @@
             </w:pPr>
             <w:r>
               <w:t xml:space="preserve">(✓)</w:t>
+            </w:r>
+          </w:p>
+        </w:tc>
+        <w:tc>
+          <w:tcPr/>
+          <w:p>
+            <w:pPr>
+              <w:pStyle w:val="Compact"/>
+              <w:jc w:val="left"/>
+            </w:pPr>
+            <w:r>
+              <w:t xml:space="preserve">–</w:t>
+            </w:r>
+          </w:p>
+        </w:tc>
+      </w:tr>
+      <w:tr>
+        <w:tc>
+          <w:tcPr/>
+          <w:p>
+            <w:pPr>
+              <w:pStyle w:val="Compact"/>
+              <w:jc w:val="left"/>
+            </w:pPr>
+            <w:r>
+              <w:t xml:space="preserve">Khrennikov (2026)</w:t>
+            </w:r>
+          </w:p>
+        </w:tc>
+        <w:tc>
+          <w:tcPr/>
+          <w:p>
+            <w:pPr>
+              <w:pStyle w:val="Compact"/>
+              <w:jc w:val="left"/>
+            </w:pPr>
+            <w:r>
+              <w:t xml:space="preserve">Quantum-like cognition and AI</w:t>
+            </w:r>
+          </w:p>
+        </w:tc>
+        <w:tc>
+          <w:tcPr/>
+          <w:p>
+            <w:pPr>
+              <w:pStyle w:val="Compact"/>
+              <w:jc w:val="left"/>
+            </w:pPr>
+            <w:r>
+              <w:t xml:space="preserve">(✓)</w:t>
+            </w:r>
+          </w:p>
+        </w:tc>
+        <w:tc>
+          <w:tcPr/>
+          <w:p>
+            <w:pPr>
+              <w:pStyle w:val="Compact"/>
+              <w:jc w:val="left"/>
+            </w:pPr>
+            <w:r>
+              <w:t xml:space="preserve">–</w:t>
+            </w:r>
+          </w:p>
+        </w:tc>
+        <w:tc>
+          <w:tcPr/>
+          <w:p>
+            <w:pPr>
+              <w:pStyle w:val="Compact"/>
+              <w:jc w:val="left"/>
+            </w:pPr>
+            <w:r>
+              <w:t xml:space="preserve">(✓)</w:t>
+            </w:r>
+          </w:p>
+        </w:tc>
+        <w:tc>
+          <w:tcPr/>
+          <w:p>
+            <w:pPr>
+              <w:pStyle w:val="Compact"/>
+              <w:jc w:val="left"/>
+            </w:pPr>
+            <w:r>
+              <w:t xml:space="preserve">–</w:t>
+            </w:r>
+          </w:p>
+        </w:tc>
+        <w:tc>
+          <w:tcPr/>
+          <w:p>
+            <w:pPr>
+              <w:pStyle w:val="Compact"/>
+              <w:jc w:val="left"/>
+            </w:pPr>
+            <w:r>
+              <w:t xml:space="preserve">–</w:t>
             </w:r>
           </w:p>
         </w:tc>

</xml_diff>

<commit_message>
Survey 2: redraw all figures by script in a plain journal style (print-size, Latin Modern, muted palette); save RL run data
</commit_message>
<xml_diff>
--- a/github/m/Survey2_AIR_Manuscript.docx
+++ b/github/m/Survey2_AIR_Manuscript.docx
@@ -3496,7 +3496,7 @@
       <w:r>
         <w:drawing>
           <wp:inline>
-            <wp:extent cx="5311790" cy="4709849"/>
+            <wp:extent cx="4713968" cy="3801095"/>
             <wp:effectExtent b="0" l="0" r="0" t="0"/>
             <wp:docPr descr="" title="" id="38" name="Picture"/>
             <a:graphic>
@@ -3517,7 +3517,7 @@
                   <pic:spPr bwMode="auto">
                     <a:xfrm>
                       <a:off x="0" y="0"/>
-                      <a:ext cx="5311790" cy="4709849"/>
+                      <a:ext cx="4713968" cy="3801095"/>
                     </a:xfrm>
                     <a:prstGeom prst="rect">
                       <a:avLst/>
@@ -5717,7 +5717,7 @@
       <w:r>
         <w:drawing>
           <wp:inline>
-            <wp:extent cx="3307080" cy="3395101"/>
+            <wp:extent cx="2921805" cy="2688244"/>
             <wp:effectExtent b="0" l="0" r="0" t="0"/>
             <wp:docPr descr="" title="" id="73" name="Picture"/>
             <a:graphic>
@@ -5738,7 +5738,7 @@
                   <pic:spPr bwMode="auto">
                     <a:xfrm>
                       <a:off x="0" y="0"/>
-                      <a:ext cx="3307080" cy="3395101"/>
+                      <a:ext cx="2921805" cy="2688244"/>
                     </a:xfrm>
                     <a:prstGeom prst="rect">
                       <a:avLst/>
@@ -5808,7 +5808,7 @@
         <w:t xml:space="preserve"> </w:t>
       </w:r>
       <w:r>
-        <w:t xml:space="preserve">(blue path) or in the reverse order (orange path). With the angles used in Example 1 (Section 5.3), p(A then B) = 0.29 and p(B then A) = 0.22, while the QQ equality is satisfied exactly</w:t>
+        <w:t xml:space="preserve">(solid path) or in the reverse order (dashed path). With the angles used in Example 1 (Section 5.3), p(A then B) = 0.29 and p(B then A) = 0.22, while the QQ equality is satisfied exactly</w:t>
       </w:r>
     </w:p>
     <w:p>
@@ -5818,7 +5818,7 @@
       <w:r>
         <w:drawing>
           <wp:inline>
-            <wp:extent cx="2933700" cy="2519933"/>
+            <wp:extent cx="2592072" cy="2462315"/>
             <wp:effectExtent b="0" l="0" r="0" t="0"/>
             <wp:docPr descr="" title="" id="76" name="Picture"/>
             <a:graphic>
@@ -5839,7 +5839,7 @@
                   <pic:spPr bwMode="auto">
                     <a:xfrm>
                       <a:off x="0" y="0"/>
-                      <a:ext cx="2933700" cy="2519933"/>
+                      <a:ext cx="2592072" cy="2462315"/>
                     </a:xfrm>
                     <a:prstGeom prst="rect">
                       <a:avLst/>
@@ -7553,7 +7553,7 @@
       <w:r>
         <w:drawing>
           <wp:inline>
-            <wp:extent cx="4000500" cy="2207744"/>
+            <wp:extent cx="3535476" cy="1979927"/>
             <wp:effectExtent b="0" l="0" r="0" t="0"/>
             <wp:docPr descr="" title="" id="88" name="Picture"/>
             <a:graphic>
@@ -7574,7 +7574,7 @@
                   <pic:spPr bwMode="auto">
                     <a:xfrm>
                       <a:off x="0" y="0"/>
-                      <a:ext cx="4000500" cy="2207744"/>
+                      <a:ext cx="3535476" cy="1979927"/>
                     </a:xfrm>
                     <a:prstGeom prst="rect">
                       <a:avLst/>
@@ -7787,7 +7787,7 @@
       <w:r>
         <w:drawing>
           <wp:inline>
-            <wp:extent cx="5334000" cy="3247301"/>
+            <wp:extent cx="4713968" cy="2976761"/>
             <wp:effectExtent b="0" l="0" r="0" t="0"/>
             <wp:docPr descr="" title="" id="94" name="Picture"/>
             <a:graphic>
@@ -7808,7 +7808,7 @@
                   <pic:spPr bwMode="auto">
                     <a:xfrm>
                       <a:off x="0" y="0"/>
-                      <a:ext cx="5334000" cy="3247301"/>
+                      <a:ext cx="4713968" cy="2976761"/>
                     </a:xfrm>
                     <a:prstGeom prst="rect">
                       <a:avLst/>
@@ -10556,7 +10556,7 @@
       <w:r>
         <w:drawing>
           <wp:inline>
-            <wp:extent cx="5334000" cy="2897619"/>
+            <wp:extent cx="4713968" cy="2381409"/>
             <wp:effectExtent b="0" l="0" r="0" t="0"/>
             <wp:docPr descr="" title="" id="148" name="Picture"/>
             <a:graphic>
@@ -10577,7 +10577,7 @@
                   <pic:spPr bwMode="auto">
                     <a:xfrm>
                       <a:off x="0" y="0"/>
-                      <a:ext cx="5334000" cy="2897619"/>
+                      <a:ext cx="4713968" cy="2381409"/>
                     </a:xfrm>
                     <a:prstGeom prst="rect">
                       <a:avLst/>
@@ -11294,7 +11294,7 @@
       <w:r>
         <w:drawing>
           <wp:inline>
-            <wp:extent cx="5067300" cy="2887182"/>
+            <wp:extent cx="4477354" cy="2701983"/>
             <wp:effectExtent b="0" l="0" r="0" t="0"/>
             <wp:docPr descr="" title="" id="166" name="Picture"/>
             <a:graphic>
@@ -11315,7 +11315,7 @@
                   <pic:spPr bwMode="auto">
                     <a:xfrm>
                       <a:off x="0" y="0"/>
-                      <a:ext cx="5067300" cy="2887182"/>
+                      <a:ext cx="4477354" cy="2701983"/>
                     </a:xfrm>
                     <a:prstGeom prst="rect">
                       <a:avLst/>
@@ -12576,7 +12576,7 @@
       <w:r>
         <w:drawing>
           <wp:inline>
-            <wp:extent cx="5067300" cy="2752738"/>
+            <wp:extent cx="4477354" cy="2701983"/>
             <wp:effectExtent b="0" l="0" r="0" t="0"/>
             <wp:docPr descr="" title="" id="183" name="Picture"/>
             <a:graphic>
@@ -12597,7 +12597,7 @@
                   <pic:spPr bwMode="auto">
                     <a:xfrm>
                       <a:off x="0" y="0"/>
-                      <a:ext cx="5067300" cy="2752738"/>
+                      <a:ext cx="4477354" cy="2701983"/>
                     </a:xfrm>
                     <a:prstGeom prst="rect">
                       <a:avLst/>
@@ -13958,7 +13958,7 @@
       <w:r>
         <w:drawing>
           <wp:inline>
-            <wp:extent cx="5334000" cy="2846885"/>
+            <wp:extent cx="4713968" cy="2027250"/>
             <wp:effectExtent b="0" l="0" r="0" t="0"/>
             <wp:docPr descr="" title="" id="212" name="Picture"/>
             <a:graphic>
@@ -13979,7 +13979,7 @@
                   <pic:spPr bwMode="auto">
                     <a:xfrm>
                       <a:off x="0" y="0"/>
-                      <a:ext cx="5334000" cy="2846885"/>
+                      <a:ext cx="4713968" cy="2027250"/>
                     </a:xfrm>
                     <a:prstGeom prst="rect">
                       <a:avLst/>

</xml_diff>